<commit_message>
created customized page response in user module
</commit_message>
<xml_diff>
--- a/Images.docx
+++ b/Images.docx
@@ -24,6 +24,9 @@
         <w:pStyle w:val="ListParagraph"/>
       </w:pPr>
       <w:r>
+        <w:rPr>
+          <w:noProof/>
+        </w:rPr>
         <w:drawing>
           <wp:inline distT="0" distB="0" distL="0" distR="0" wp14:anchorId="17D774BC" wp14:editId="7EA40B71">
             <wp:extent cx="5731510" cy="3631565"/>
@@ -83,6 +86,9 @@
         <w:pStyle w:val="ListParagraph"/>
       </w:pPr>
       <w:r>
+        <w:rPr>
+          <w:noProof/>
+        </w:rPr>
         <w:drawing>
           <wp:inline distT="0" distB="0" distL="0" distR="0" wp14:anchorId="4A744A6E" wp14:editId="5266E0B0">
             <wp:extent cx="5731510" cy="3672840"/>
@@ -137,6 +143,9 @@
         <w:pStyle w:val="ListParagraph"/>
       </w:pPr>
       <w:r>
+        <w:rPr>
+          <w:noProof/>
+        </w:rPr>
         <w:lastRenderedPageBreak/>
         <w:drawing>
           <wp:inline distT="0" distB="0" distL="0" distR="0" wp14:anchorId="5BD1F576" wp14:editId="6F873B15">
@@ -192,6 +201,9 @@
         <w:pStyle w:val="ListParagraph"/>
       </w:pPr>
       <w:r>
+        <w:rPr>
+          <w:noProof/>
+        </w:rPr>
         <w:drawing>
           <wp:inline distT="0" distB="0" distL="0" distR="0" wp14:anchorId="027377C6" wp14:editId="31732D6C">
             <wp:extent cx="5731510" cy="3826510"/>
@@ -246,6 +258,9 @@
         <w:pStyle w:val="ListParagraph"/>
       </w:pPr>
       <w:r>
+        <w:rPr>
+          <w:noProof/>
+        </w:rPr>
         <w:lastRenderedPageBreak/>
         <w:drawing>
           <wp:inline distT="0" distB="0" distL="0" distR="0" wp14:anchorId="4FB042C3" wp14:editId="13F2FC04">
@@ -301,6 +316,9 @@
         <w:pStyle w:val="ListParagraph"/>
       </w:pPr>
       <w:r>
+        <w:rPr>
+          <w:noProof/>
+        </w:rPr>
         <w:drawing>
           <wp:inline distT="0" distB="0" distL="0" distR="0" wp14:anchorId="0EA98C1D" wp14:editId="67863A84">
             <wp:extent cx="5731510" cy="3393440"/>
@@ -355,6 +373,9 @@
         <w:pStyle w:val="ListParagraph"/>
       </w:pPr>
       <w:r>
+        <w:rPr>
+          <w:noProof/>
+        </w:rPr>
         <w:lastRenderedPageBreak/>
         <w:drawing>
           <wp:inline distT="0" distB="0" distL="0" distR="0" wp14:anchorId="489EABEB" wp14:editId="0298734B">
@@ -381,6 +402,237 @@
                     <a:xfrm>
                       <a:off x="0" y="0"/>
                       <a:ext cx="5731510" cy="2955925"/>
+                    </a:xfrm>
+                    <a:prstGeom prst="rect">
+                      <a:avLst/>
+                    </a:prstGeom>
+                  </pic:spPr>
+                </pic:pic>
+              </a:graphicData>
+            </a:graphic>
+          </wp:inline>
+        </w:drawing>
+      </w:r>
+    </w:p>
+    <w:p>
+      <w:pPr>
+        <w:pStyle w:val="ListParagraph"/>
+      </w:pPr>
+    </w:p>
+    <w:p>
+      <w:pPr>
+        <w:pStyle w:val="ListParagraph"/>
+        <w:numPr>
+          <w:ilvl w:val="0"/>
+          <w:numId w:val="1"/>
+        </w:numPr>
+      </w:pPr>
+      <w:r>
+        <w:t>Bean Validation</w:t>
+      </w:r>
+    </w:p>
+    <w:p>
+      <w:pPr>
+        <w:pStyle w:val="ListParagraph"/>
+      </w:pPr>
+      <w:r>
+        <w:drawing>
+          <wp:inline distT="0" distB="0" distL="0" distR="0" wp14:anchorId="30CDE061" wp14:editId="209A15E8">
+            <wp:extent cx="5731510" cy="3590925"/>
+            <wp:effectExtent l="0" t="0" r="2540" b="9525"/>
+            <wp:docPr id="2018581024" name="Picture 1"/>
+            <wp:cNvGraphicFramePr>
+              <a:graphicFrameLocks xmlns:a="http://schemas.openxmlformats.org/drawingml/2006/main" noChangeAspect="1"/>
+            </wp:cNvGraphicFramePr>
+            <a:graphic xmlns:a="http://schemas.openxmlformats.org/drawingml/2006/main">
+              <a:graphicData uri="http://schemas.openxmlformats.org/drawingml/2006/picture">
+                <pic:pic xmlns:pic="http://schemas.openxmlformats.org/drawingml/2006/picture">
+                  <pic:nvPicPr>
+                    <pic:cNvPr id="2018581024" name=""/>
+                    <pic:cNvPicPr/>
+                  </pic:nvPicPr>
+                  <pic:blipFill>
+                    <a:blip r:embed="rId12"/>
+                    <a:stretch>
+                      <a:fillRect/>
+                    </a:stretch>
+                  </pic:blipFill>
+                  <pic:spPr>
+                    <a:xfrm>
+                      <a:off x="0" y="0"/>
+                      <a:ext cx="5731510" cy="3590925"/>
+                    </a:xfrm>
+                    <a:prstGeom prst="rect">
+                      <a:avLst/>
+                    </a:prstGeom>
+                  </pic:spPr>
+                </pic:pic>
+              </a:graphicData>
+            </a:graphic>
+          </wp:inline>
+        </w:drawing>
+      </w:r>
+    </w:p>
+    <w:p>
+      <w:pPr>
+        <w:pStyle w:val="ListParagraph"/>
+        <w:numPr>
+          <w:ilvl w:val="0"/>
+          <w:numId w:val="1"/>
+        </w:numPr>
+      </w:pPr>
+      <w:r>
+        <w:t>Global Exception Handling</w:t>
+      </w:r>
+    </w:p>
+    <w:p>
+      <w:pPr>
+        <w:pStyle w:val="ListParagraph"/>
+      </w:pPr>
+      <w:r>
+        <w:lastRenderedPageBreak/>
+        <w:drawing>
+          <wp:inline distT="0" distB="0" distL="0" distR="0" wp14:anchorId="6C8E95EF" wp14:editId="517E9B92">
+            <wp:extent cx="5731510" cy="3253740"/>
+            <wp:effectExtent l="0" t="0" r="2540" b="3810"/>
+            <wp:docPr id="648190519" name="Picture 1" descr="A screenshot of a computer&#10;&#10;Description automatically generated"/>
+            <wp:cNvGraphicFramePr>
+              <a:graphicFrameLocks xmlns:a="http://schemas.openxmlformats.org/drawingml/2006/main" noChangeAspect="1"/>
+            </wp:cNvGraphicFramePr>
+            <a:graphic xmlns:a="http://schemas.openxmlformats.org/drawingml/2006/main">
+              <a:graphicData uri="http://schemas.openxmlformats.org/drawingml/2006/picture">
+                <pic:pic xmlns:pic="http://schemas.openxmlformats.org/drawingml/2006/picture">
+                  <pic:nvPicPr>
+                    <pic:cNvPr id="648190519" name="Picture 1" descr="A screenshot of a computer&#10;&#10;Description automatically generated"/>
+                    <pic:cNvPicPr/>
+                  </pic:nvPicPr>
+                  <pic:blipFill>
+                    <a:blip r:embed="rId13"/>
+                    <a:stretch>
+                      <a:fillRect/>
+                    </a:stretch>
+                  </pic:blipFill>
+                  <pic:spPr>
+                    <a:xfrm>
+                      <a:off x="0" y="0"/>
+                      <a:ext cx="5731510" cy="3253740"/>
+                    </a:xfrm>
+                    <a:prstGeom prst="rect">
+                      <a:avLst/>
+                    </a:prstGeom>
+                  </pic:spPr>
+                </pic:pic>
+              </a:graphicData>
+            </a:graphic>
+          </wp:inline>
+        </w:drawing>
+      </w:r>
+    </w:p>
+    <w:p>
+      <w:pPr>
+        <w:pStyle w:val="ListParagraph"/>
+        <w:numPr>
+          <w:ilvl w:val="0"/>
+          <w:numId w:val="1"/>
+        </w:numPr>
+      </w:pPr>
+      <w:r>
+        <w:t xml:space="preserve">Implementation of pagination </w:t>
+      </w:r>
+      <w:r>
+        <w:t xml:space="preserve"> and sorting </w:t>
+      </w:r>
+    </w:p>
+    <w:p>
+      <w:pPr>
+        <w:pStyle w:val="ListParagraph"/>
+      </w:pPr>
+      <w:r>
+        <w:drawing>
+          <wp:inline distT="0" distB="0" distL="0" distR="0" wp14:anchorId="1D4348D6" wp14:editId="6DD2244B">
+            <wp:extent cx="5731510" cy="3773805"/>
+            <wp:effectExtent l="0" t="0" r="2540" b="0"/>
+            <wp:docPr id="1880521141" name="Picture 1"/>
+            <wp:cNvGraphicFramePr>
+              <a:graphicFrameLocks xmlns:a="http://schemas.openxmlformats.org/drawingml/2006/main" noChangeAspect="1"/>
+            </wp:cNvGraphicFramePr>
+            <a:graphic xmlns:a="http://schemas.openxmlformats.org/drawingml/2006/main">
+              <a:graphicData uri="http://schemas.openxmlformats.org/drawingml/2006/picture">
+                <pic:pic xmlns:pic="http://schemas.openxmlformats.org/drawingml/2006/picture">
+                  <pic:nvPicPr>
+                    <pic:cNvPr id="1880521141" name=""/>
+                    <pic:cNvPicPr/>
+                  </pic:nvPicPr>
+                  <pic:blipFill>
+                    <a:blip r:embed="rId14"/>
+                    <a:stretch>
+                      <a:fillRect/>
+                    </a:stretch>
+                  </pic:blipFill>
+                  <pic:spPr>
+                    <a:xfrm>
+                      <a:off x="0" y="0"/>
+                      <a:ext cx="5731510" cy="3773805"/>
+                    </a:xfrm>
+                    <a:prstGeom prst="rect">
+                      <a:avLst/>
+                    </a:prstGeom>
+                  </pic:spPr>
+                </pic:pic>
+              </a:graphicData>
+            </a:graphic>
+          </wp:inline>
+        </w:drawing>
+      </w:r>
+    </w:p>
+    <w:p>
+      <w:pPr>
+        <w:pStyle w:val="ListParagraph"/>
+      </w:pPr>
+    </w:p>
+    <w:p>
+      <w:pPr>
+        <w:pStyle w:val="ListParagraph"/>
+        <w:numPr>
+          <w:ilvl w:val="0"/>
+          <w:numId w:val="1"/>
+        </w:numPr>
+      </w:pPr>
+      <w:r>
+        <w:t>Customized Page Response</w:t>
+      </w:r>
+    </w:p>
+    <w:p>
+      <w:pPr>
+        <w:pStyle w:val="ListParagraph"/>
+      </w:pPr>
+      <w:r>
+        <w:lastRenderedPageBreak/>
+        <w:drawing>
+          <wp:inline distT="0" distB="0" distL="0" distR="0" wp14:anchorId="361B8C90" wp14:editId="22727DE3">
+            <wp:extent cx="5731510" cy="3859530"/>
+            <wp:effectExtent l="0" t="0" r="2540" b="7620"/>
+            <wp:docPr id="873119267" name="Picture 1"/>
+            <wp:cNvGraphicFramePr>
+              <a:graphicFrameLocks xmlns:a="http://schemas.openxmlformats.org/drawingml/2006/main" noChangeAspect="1"/>
+            </wp:cNvGraphicFramePr>
+            <a:graphic xmlns:a="http://schemas.openxmlformats.org/drawingml/2006/main">
+              <a:graphicData uri="http://schemas.openxmlformats.org/drawingml/2006/picture">
+                <pic:pic xmlns:pic="http://schemas.openxmlformats.org/drawingml/2006/picture">
+                  <pic:nvPicPr>
+                    <pic:cNvPr id="873119267" name=""/>
+                    <pic:cNvPicPr/>
+                  </pic:nvPicPr>
+                  <pic:blipFill>
+                    <a:blip r:embed="rId15"/>
+                    <a:stretch>
+                      <a:fillRect/>
+                    </a:stretch>
+                  </pic:blipFill>
+                  <pic:spPr>
+                    <a:xfrm>
+                      <a:off x="0" y="0"/>
+                      <a:ext cx="5731510" cy="3859530"/>
                     </a:xfrm>
                     <a:prstGeom prst="rect">
                       <a:avLst/>

</xml_diff>

<commit_message>
implemented pagination logic for custom methods
</commit_message>
<xml_diff>
--- a/Images.docx
+++ b/Images.docx
@@ -250,8 +250,13 @@
         </w:numPr>
       </w:pPr>
       <w:r>
-        <w:t>Get user by email</w:t>
-      </w:r>
+        <w:t xml:space="preserve">Get user by </w:t>
+      </w:r>
+      <w:proofErr w:type="gramStart"/>
+      <w:r>
+        <w:t>email</w:t>
+      </w:r>
+      <w:proofErr w:type="gramEnd"/>
     </w:p>
     <w:p>
       <w:pPr>
@@ -308,8 +313,13 @@
         </w:numPr>
       </w:pPr>
       <w:r>
-        <w:t>Get user by name</w:t>
-      </w:r>
+        <w:t xml:space="preserve">Get user by </w:t>
+      </w:r>
+      <w:proofErr w:type="gramStart"/>
+      <w:r>
+        <w:t>name</w:t>
+      </w:r>
+      <w:proofErr w:type="gramEnd"/>
     </w:p>
     <w:p>
       <w:pPr>
@@ -365,8 +375,13 @@
         </w:numPr>
       </w:pPr>
       <w:r>
-        <w:t>Delete user</w:t>
-      </w:r>
+        <w:t xml:space="preserve">Delete </w:t>
+      </w:r>
+      <w:proofErr w:type="gramStart"/>
+      <w:r>
+        <w:t>user</w:t>
+      </w:r>
+      <w:proofErr w:type="gramEnd"/>
     </w:p>
     <w:p>
       <w:pPr>
@@ -537,10 +552,18 @@
         </w:numPr>
       </w:pPr>
       <w:r>
-        <w:t xml:space="preserve">Implementation of pagination </w:t>
-      </w:r>
-      <w:r>
-        <w:t xml:space="preserve"> and sorting </w:t>
+        <w:t xml:space="preserve">Implementation of </w:t>
+      </w:r>
+      <w:proofErr w:type="gramStart"/>
+      <w:r>
+        <w:t xml:space="preserve">pagination </w:t>
+      </w:r>
+      <w:r>
+        <w:t xml:space="preserve"> and</w:t>
+      </w:r>
+      <w:proofErr w:type="gramEnd"/>
+      <w:r>
+        <w:t xml:space="preserve"> sorting </w:t>
       </w:r>
     </w:p>
     <w:p>
@@ -644,6 +667,16 @@
           </wp:inline>
         </w:drawing>
       </w:r>
+    </w:p>
+    <w:p>
+      <w:pPr>
+        <w:pStyle w:val="ListParagraph"/>
+      </w:pPr>
+    </w:p>
+    <w:p>
+      <w:pPr>
+        <w:pStyle w:val="ListParagraph"/>
+      </w:pPr>
     </w:p>
     <w:sectPr>
       <w:pgSz w:w="11906" w:h="16838"/>

</xml_diff>